<commit_message>
feat: Enhance URS document management with row deletion and renumbering
- Implemented row deletion functionality for URS requirements in the Word document.
- Added sequential renumbering of remaining URS rows after deletion to maintain order.
- Introduced a new API endpoint for deleting URS rows and syncing changes with Google Drive.
- Updated frontend logic to handle requirement addition and deletion, ensuring local storage reflects document state.
- Improved table formatting for better readability and alignment in the Word document.
- Enhanced user experience by providing alerts and confirmations during requirement management.
</commit_message>
<xml_diff>
--- a/backend/docs/URS - User Requirements Specification.docx
+++ b/backend/docs/URS - User Requirements Specification.docx
@@ -6006,6 +6006,9 @@
                 <w:szCs w:val="20"/>
               </w:rPr>
             </w:pPr>
+            <w:r>
+              <w:t>URS_004</w:t>
+            </w:r>
           </w:p>
         </w:tc>
         <w:tc>
@@ -6028,6 +6031,9 @@
                 <w:szCs w:val="20"/>
               </w:rPr>
             </w:pPr>
+            <w:r>
+              <w:t>Health Application shall ensure seamless user experience by optimizing page performance, thereby preventing any page reload or lag during project creation, and maintaining data integrity as per 21 CFR 11.10(a) system validation and intended performance, although this is more related to system infrastructure, it is categorized under GAMP 5 Category 1, being infrastructure software. The Health Application will achieve this through efficient coding, caching, and asynchronous data processing, ensuring a responsive and reliable system. This optimization will indirectly support compliance with electronic records and system performance regulations.</w:t>
+            </w:r>
           </w:p>
         </w:tc>
         <w:tc>
@@ -6050,6 +6056,9 @@
                 <w:szCs w:val="20"/>
               </w:rPr>
             </w:pPr>
+            <w:r>
+              <w:t>No</w:t>
+            </w:r>
           </w:p>
         </w:tc>
         <w:tc>
@@ -6072,6 +6081,9 @@
                 <w:szCs w:val="20"/>
               </w:rPr>
             </w:pPr>
+            <w:r>
+              <w:t>N/A</w:t>
+            </w:r>
           </w:p>
         </w:tc>
         <w:tc>
@@ -6094,6 +6106,9 @@
                 <w:szCs w:val="20"/>
               </w:rPr>
             </w:pPr>
+            <w:r>
+              <w:t>Low</w:t>
+            </w:r>
           </w:p>
         </w:tc>
       </w:tr>
@@ -6121,6 +6136,9 @@
                 <w:szCs w:val="20"/>
               </w:rPr>
             </w:pPr>
+            <w:r>
+              <w:t>URS_005</w:t>
+            </w:r>
           </w:p>
         </w:tc>
         <w:tc>
@@ -6143,6 +6161,9 @@
                 <w:szCs w:val="20"/>
               </w:rPr>
             </w:pPr>
+            <w:r>
+              <w:t>The Health Application shall restrict access to authorized individuals based on their roles, ensuring that different users have different levels of access to the project, as per 21 CFR 11.10(d) and 21 CFR 11.10(g), and maintain a time-stamped, computer-generated audit trail to track all system activities, including changes, additions, or deletions, in accordance with 21 CFR 11.10(e). The Health Application will implement authority and privilege checks to ensure that system access is limited to authorized individuals, and all access attempts will be recorded in the audit trail. The audit trail will be protected from modification or deletion to ensure data integrity and compliance with regulatory requirements.</w:t>
+            </w:r>
           </w:p>
         </w:tc>
         <w:tc>
@@ -6165,6 +6186,9 @@
                 <w:szCs w:val="20"/>
               </w:rPr>
             </w:pPr>
+            <w:r>
+              <w:t>Yes</w:t>
+            </w:r>
           </w:p>
         </w:tc>
         <w:tc>
@@ -6187,6 +6211,9 @@
                 <w:szCs w:val="20"/>
               </w:rPr>
             </w:pPr>
+            <w:r>
+              <w:t>21 CFR 11.10(d) / 21 CFR 11.10(g) / 21 CFR 11.10(e)</w:t>
+            </w:r>
           </w:p>
         </w:tc>
         <w:tc>
@@ -6209,6 +6236,9 @@
                 <w:szCs w:val="20"/>
               </w:rPr>
             </w:pPr>
+            <w:r>
+              <w:t>Medium</w:t>
+            </w:r>
           </w:p>
         </w:tc>
       </w:tr>
@@ -6236,6 +6266,9 @@
                 <w:szCs w:val="20"/>
               </w:rPr>
             </w:pPr>
+            <w:r>
+              <w:t>URS_005</w:t>
+            </w:r>
           </w:p>
         </w:tc>
         <w:tc>
@@ -6258,6 +6291,9 @@
                 <w:szCs w:val="20"/>
               </w:rPr>
             </w:pPr>
+            <w:r>
+              <w:t>The Health Application shall ensure that users can login properly without any errors or issues, by implementing a secure authentication mechanism that includes a username and password, and also by limiting system access to authorized individuals as per 21 CFR 11.10(d), and maintaining an audit trail of all login attempts as per 21 CFR 11.10(e). The Health Application shall also ensure that all login attempts are time-stamped and include a reason for change, if any. Furthermore, the application shall comply with 21 CFR 11.300 by using secure identification codes and password controls.</w:t>
+            </w:r>
           </w:p>
         </w:tc>
         <w:tc>
@@ -6280,6 +6316,9 @@
                 <w:szCs w:val="20"/>
               </w:rPr>
             </w:pPr>
+            <w:r>
+              <w:t>Yes</w:t>
+            </w:r>
           </w:p>
         </w:tc>
         <w:tc>
@@ -6302,6 +6341,9 @@
                 <w:szCs w:val="20"/>
               </w:rPr>
             </w:pPr>
+            <w:r>
+              <w:t>21 CFR 11.10(d) / 21 CFR 11.10(g) / 21 CFR 11.300</w:t>
+            </w:r>
           </w:p>
         </w:tc>
         <w:tc>
@@ -6324,6 +6366,9 @@
                 <w:szCs w:val="20"/>
               </w:rPr>
             </w:pPr>
+            <w:r>
+              <w:t>Medium</w:t>
+            </w:r>
           </w:p>
         </w:tc>
       </w:tr>

</xml_diff>